<commit_message>
F550 final project finished
</commit_message>
<xml_diff>
--- a/Project/F550 Project Cover.docx
+++ b/Project/F550 Project Cover.docx
@@ -65,6 +65,7 @@
                 <w:szCs w:val="28"/>
               </w:rPr>
             </w:pPr>
+            <w:bookmarkStart w:id="0" w:name="_GoBack" w:colFirst="0" w:colLast="1"/>
             <w:r>
               <w:rPr>
                 <w:rFonts w:ascii="Arial" w:hAnsi="Arial" w:cs="Arial"/>
@@ -426,8 +427,6 @@
               </w:rPr>
               <w:t xml:space="preserve"> Apr 2026</w:t>
             </w:r>
-            <w:bookmarkStart w:id="0" w:name="_GoBack"/>
-            <w:bookmarkEnd w:id="0"/>
           </w:p>
         </w:tc>
       </w:tr>
@@ -485,9 +484,17 @@
               <w:spacing w:after="0" w:line="240" w:lineRule="auto"/>
               <w:jc w:val="center"/>
               <w:rPr>
-                <w:rFonts w:ascii="Arial" w:hAnsi="Arial" w:cs="Arial"/>
+                <w:rFonts w:hint="eastAsia" w:ascii="Arial" w:hAnsi="Arial" w:eastAsia="宋体" w:cs="Arial"/>
+                <w:lang w:val="en-US" w:eastAsia="zh-CN"/>
               </w:rPr>
             </w:pPr>
+            <w:r>
+              <w:rPr>
+                <w:rFonts w:hint="eastAsia" w:ascii="Arial" w:hAnsi="Arial" w:eastAsia="宋体" w:cs="Arial"/>
+                <w:lang w:val="en-US" w:eastAsia="zh-CN"/>
+              </w:rPr>
+              <w:t>-</w:t>
+            </w:r>
           </w:p>
         </w:tc>
       </w:tr>
@@ -811,6 +818,7 @@
           </w:p>
         </w:tc>
       </w:tr>
+      <w:bookmarkEnd w:id="0"/>
     </w:tbl>
     <w:p>
       <w:pPr>
@@ -1752,6 +1760,7 @@
     <w:name w:val="Subtitle Char"/>
     <w:basedOn w:val="18"/>
     <w:link w:val="14"/>
+    <w:qFormat/>
     <w:uiPriority w:val="11"/>
     <w:rPr>
       <w:rFonts w:eastAsiaTheme="majorEastAsia" w:cstheme="majorBidi"/>
@@ -2184,12 +2193,14 @@
 </file>
 
 <file path=customXml/item1.xml><?xml version="1.0" encoding="utf-8"?>
-<?mso-contentType ?>
-<FormTemplates xmlns="http://schemas.microsoft.com/sharepoint/v3/contenttype/forms">
-  <Display>DocumentLibraryForm</Display>
-  <Edit>DocumentLibraryForm</Edit>
-  <New>DocumentLibraryForm</New>
-</FormTemplates>
+<p:properties xmlns:p="http://schemas.microsoft.com/office/2006/metadata/properties" xmlns:xsi="http://www.w3.org/2001/XMLSchema-instance" xmlns:pc="http://schemas.microsoft.com/office/infopath/2007/PartnerControls">
+  <documentManagement>
+    <lcf76f155ced4ddcb4097134ff3c332f xmlns="c902860d-36d0-4cb4-8c26-73dacac36dc7">
+      <Terms xmlns="http://schemas.microsoft.com/office/infopath/2007/PartnerControls"/>
+    </lcf76f155ced4ddcb4097134ff3c332f>
+    <TaxCatchAll xmlns="4802f5d8-eb31-4047-8075-bf0e2351b4f3" xsi:nil="true"/>
+  </documentManagement>
+</p:properties>
 </file>
 
 <file path=customXml/item2.xml><?xml version="1.0" encoding="utf-8"?>
@@ -2428,18 +2439,16 @@
 </file>
 
 <file path=customXml/item3.xml><?xml version="1.0" encoding="utf-8"?>
-<p:properties xmlns:p="http://schemas.microsoft.com/office/2006/metadata/properties" xmlns:xsi="http://www.w3.org/2001/XMLSchema-instance" xmlns:pc="http://schemas.microsoft.com/office/infopath/2007/PartnerControls">
-  <documentManagement>
-    <lcf76f155ced4ddcb4097134ff3c332f xmlns="c902860d-36d0-4cb4-8c26-73dacac36dc7">
-      <Terms xmlns="http://schemas.microsoft.com/office/infopath/2007/PartnerControls"/>
-    </lcf76f155ced4ddcb4097134ff3c332f>
-    <TaxCatchAll xmlns="4802f5d8-eb31-4047-8075-bf0e2351b4f3" xsi:nil="true"/>
-  </documentManagement>
-</p:properties>
+<?mso-contentType ?>
+<FormTemplates xmlns="http://schemas.microsoft.com/sharepoint/v3/contenttype/forms">
+  <Display>DocumentLibraryForm</Display>
+  <Edit>DocumentLibraryForm</Edit>
+  <New>DocumentLibraryForm</New>
+</FormTemplates>
 </file>
 
 <file path=customXml/itemProps1.xml><?xml version="1.0" encoding="utf-8"?>
-<ds:datastoreItem xmlns:ds="http://schemas.openxmlformats.org/officeDocument/2006/customXml" ds:itemID="{44316F4E-9006-4F3E-BE8E-EFAC839E745F}">
+<ds:datastoreItem xmlns:ds="http://schemas.openxmlformats.org/officeDocument/2006/customXml" ds:itemID="{467A1609-3A87-4E1A-8377-495C0EC766C0}">
   <ds:schemaRefs/>
 </ds:datastoreItem>
 </file>
@@ -2451,7 +2460,7 @@
 </file>
 
 <file path=customXml/itemProps3.xml><?xml version="1.0" encoding="utf-8"?>
-<ds:datastoreItem xmlns:ds="http://schemas.openxmlformats.org/officeDocument/2006/customXml" ds:itemID="{467A1609-3A87-4E1A-8377-495C0EC766C0}">
+<ds:datastoreItem xmlns:ds="http://schemas.openxmlformats.org/officeDocument/2006/customXml" ds:itemID="{44316F4E-9006-4F3E-BE8E-EFAC839E745F}">
   <ds:schemaRefs/>
 </ds:datastoreItem>
 </file>
</xml_diff>